<commit_message>
Readiness Word files rebuilt for the S1 entry conditions and O-10
The two volumes and the Word files of DOC-B05, DOC-B06, DOC-B09, DOC-B10, DOC-F02, DOC-F08 and DOC-S06.

Co-Authored-By: Claude Opus 5.5 <noreply@anthropic.com>
Claude-Session: https://claude.ai/code/session_012HHcRrzuvMBTL2FYxXtsyv
</commit_message>
<xml_diff>
--- a/treasury-platform/docs/30-readiness/word/DOC-B05-seed-and-initial-migration-plan.docx
+++ b/treasury-platform/docs/30-readiness/word/DOC-B05-seed-and-initial-migration-plan.docx
@@ -12038,7 +12038,31 @@
                 <w:szCs w:val="18"/>
                 <w:rtl/>
               </w:rPr>
-              <w:t xml:space="preserve">TaxNumber، ErpCompanyCode</w:t>
+              <w:t xml:space="preserve">ErpCompanyCode (الرقم الضريبي في </w:t>
+            </w:r>
+            <w:r>
+              <w:rPr>
+                <w:rFonts w:ascii="Courier New" w:cs="Courier New" w:eastAsia="Courier New" w:hAnsi="Courier New"/>
+                <w:b w:val="false"/>
+                <w:bCs w:val="false"/>
+                <w:color w:val="1F2937"/>
+                <w:sz w:val="16"/>
+                <w:szCs w:val="16"/>
+                <w:shd w:fill="F1F3F5" w:color="auto" w:val="clear"/>
+                <w:rtl/>
+              </w:rPr>
+              <w:t xml:space="preserve">‎pty.TaxIdentity‎</w:t>
+            </w:r>
+            <w:r>
+              <w:rPr>
+                <w:rFonts w:ascii="Arial" w:cs="Arial" w:eastAsia="Arial" w:hAnsi="Arial"/>
+                <w:b w:val="false"/>
+                <w:bCs w:val="false"/>
+                <w:sz w:val="18"/>
+                <w:szCs w:val="18"/>
+                <w:rtl/>
+              </w:rPr>
+              <w:t xml:space="preserve">، DR-25)</w:t>
             </w:r>
           </w:p>
         </w:tc>
@@ -12112,7 +12136,7 @@
                 <w:szCs w:val="18"/>
                 <w:rtl/>
               </w:rPr>
-              <w:t xml:space="preserve">تكرار ERP تحذير أو منع (BR-ORG-001)</w:t>
+              <w:t xml:space="preserve">تكرار ERP ممنوع دائمًا (BR-ORG-001، قرار المالك 2026-10-13)</w:t>
             </w:r>
           </w:p>
         </w:tc>

</xml_diff>

<commit_message>
Early warning message templates in Arabic and English (ADR 0028)
Two events by readiness, FIN.READINESS_RED (HIGH, mandatory, in-app and email)
and FIN.READINESS_AMBER (WARNING, in-app); the reason of the readiness in 049
and on fin.EarlyWarningAlert; fin.v_EarlyWarningMessageValues gives the
placeholder values in both languages. The first tenant pack,
db/seed/packs/NTF.BASE/v1, holds the two event types, their rules and eight
templates; tools/dbgen/ntf_pack.py checks it in CI and writes the test
fixture. Test CA24 renders the messages; CA23 follows the new event code.

Co-Authored-By: Claude Opus 5.5 <noreply@anthropic.com>
Claude-Session: https://claude.ai/code/session_012HHcRrzuvMBTL2FYxXtsyv
</commit_message>
<xml_diff>
--- a/treasury-platform/docs/30-readiness/word/DOC-B05-seed-and-initial-migration-plan.docx
+++ b/treasury-platform/docs/30-readiness/word/DOC-B05-seed-and-initial-migration-plan.docx
@@ -7406,7 +7406,44 @@
                 <w:szCs w:val="18"/>
                 <w:rtl/>
               </w:rPr>
-              <w:t xml:space="preserve">رموز الأحداث في 13 §9.2 ومنها رموز 10-m0-m1…:539</w:t>
+              <w:t xml:space="preserve">رموز الأحداث في 13 §9.2 ومنها رموز 10-m0-m1…:539؛ الإصدار v1 في </w:t>
+            </w:r>
+            <w:r>
+              <w:rPr>
+                <w:rFonts w:ascii="Courier New" w:cs="Courier New" w:eastAsia="Courier New" w:hAnsi="Courier New"/>
+                <w:b w:val="false"/>
+                <w:bCs w:val="false"/>
+                <w:color w:val="1F2937"/>
+                <w:sz w:val="16"/>
+                <w:szCs w:val="16"/>
+                <w:shd w:fill="F1F3F5" w:color="auto" w:val="clear"/>
+                <w:rtl/>
+              </w:rPr>
+              <w:t xml:space="preserve">‎db/seed/packs/NTF.BASE/v1/‎</w:t>
+            </w:r>
+            <w:r>
+              <w:rPr>
+                <w:rFonts w:ascii="Arial" w:cs="Arial" w:eastAsia="Arial" w:hAnsi="Arial"/>
+                <w:b w:val="false"/>
+                <w:bCs w:val="false"/>
+                <w:sz w:val="18"/>
+                <w:szCs w:val="18"/>
+                <w:rtl/>
+              </w:rPr>
+              <w:t xml:space="preserve"> (2026-10-20، ADR 0028): حدثا الإنذار المبكر وقواعدهما وثمانية قوالب بالعربية والإنجليزية، يفحصها </w:t>
+            </w:r>
+            <w:r>
+              <w:rPr>
+                <w:rFonts w:ascii="Courier New" w:cs="Courier New" w:eastAsia="Courier New" w:hAnsi="Courier New"/>
+                <w:b w:val="false"/>
+                <w:bCs w:val="false"/>
+                <w:color w:val="1F2937"/>
+                <w:sz w:val="16"/>
+                <w:szCs w:val="16"/>
+                <w:shd w:fill="F1F3F5" w:color="auto" w:val="clear"/>
+                <w:rtl/>
+              </w:rPr>
+              <w:t xml:space="preserve">‎tools/dbgen/ntf_pack.py‎</w:t>
             </w:r>
           </w:p>
         </w:tc>

</xml_diff>

<commit_message>
Review v4.0 controls: confirmed monthly figures, evidence pack, calibration, risk officer, provision matrix (ADR 0030)
Owner decision 35. Confirmed monthly balances and bank flows are frozen and
reopened with a reason by a non-author holder of fin.stats.confirm, counted
and audited. An endorsed assessment leaves the company in one JSON evidence
pack whose SHA-256 is logged. An optimistic or stale calibration against the
lenders turns a lender date AMBER and the readiness asks for a rating; the
endorsement keeps the bias of its day. The red warning reaches the endorsers.
New system role RK (risk officer). fin.ReceivableLossRate and
fin.v_ReceivableProvisionCheck compare the recorded allowance with the ageing
provision matrix (pack FIN.PROVISION, defaults for the treasury). The
NTF.BASE texts are approved as defaults. Tests CA27 to CA30.

Co-Authored-By: Claude Opus 5.5 <noreply@anthropic.com>
Claude-Session: https://claude.ai/code/session_012HHcRrzuvMBTL2FYxXtsyv
</commit_message>
<xml_diff>
--- a/treasury-platform/docs/30-readiness/word/DOC-B05-seed-and-initial-migration-plan.docx
+++ b/treasury-platform/docs/30-readiness/word/DOC-B05-seed-and-initial-migration-plan.docx
@@ -5612,7 +5612,7 @@
                 <w:szCs w:val="18"/>
                 <w:rtl/>
               </w:rPr>
-              <w:t xml:space="preserve">أدوار النظام TA وTM وFO وTE وFA وRQ وAU، بـ IsSystem=1 وSeedKey</w:t>
+              <w:t xml:space="preserve">أدوار النظام TA وTM وFO وTE وFA وRQ وAU وRK (مسؤول المخاطر، قرار المالك 35)، بـ IsSystem=1 وSeedKey</w:t>
             </w:r>
           </w:p>
         </w:tc>
@@ -7445,6 +7445,30 @@
               </w:rPr>
               <w:t xml:space="preserve">‎tools/dbgen/ntf_pack.py‎</w:t>
             </w:r>
+            <w:r>
+              <w:rPr>
+                <w:rFonts w:ascii="Arial" w:cs="Arial" w:eastAsia="Arial" w:hAnsi="Arial"/>
+                <w:b w:val="false"/>
+                <w:bCs w:val="false"/>
+                <w:sz w:val="18"/>
+                <w:szCs w:val="18"/>
+                <w:rtl/>
+              </w:rPr>
+              <w:t xml:space="preserve">؛ واعتمدها المالك افتراضًا (القرار 35)، والخزينة تعدّل نصها أو تبقيه؛ والإنذار الأحمر يصل أيضًا حاملي </w:t>
+            </w:r>
+            <w:r>
+              <w:rPr>
+                <w:rFonts w:ascii="Courier New" w:cs="Courier New" w:eastAsia="Courier New" w:hAnsi="Courier New"/>
+                <w:b w:val="false"/>
+                <w:bCs w:val="false"/>
+                <w:color w:val="1F2937"/>
+                <w:sz w:val="16"/>
+                <w:szCs w:val="16"/>
+                <w:shd w:fill="F1F3F5" w:color="auto" w:val="clear"/>
+                <w:rtl/>
+              </w:rPr>
+              <w:t xml:space="preserve">‎fin.credit.endorse‎</w:t>
+            </w:r>
           </w:p>
         </w:tc>
         <w:tc>
@@ -7558,7 +7582,7 @@
                 <w:szCs w:val="18"/>
                 <w:rtl/>
               </w:rPr>
-              <w:t xml:space="preserve">PTY.KYC</w:t>
+              <w:t xml:space="preserve">FIN.PROVISION</w:t>
             </w:r>
           </w:p>
         </w:tc>
@@ -7594,7 +7618,7 @@
                 <w:szCs w:val="18"/>
                 <w:rtl/>
               </w:rPr>
-              <w:t xml:space="preserve">pty.KycProfile، pty.KycProfileItem</w:t>
+              <w:t xml:space="preserve">fin.ReceivableLossRate</w:t>
             </w:r>
           </w:p>
         </w:tc>
@@ -7630,7 +7654,31 @@
                 <w:szCs w:val="18"/>
                 <w:rtl/>
               </w:rPr>
-              <w:t xml:space="preserve">ملفات KYC المسبقة من 05 §3؛ يُكتب كل ملف مسودة ثم بنوده ثم يُفعَّل، لأن بنود النسخة الفعّالة لا تتغير (ADR 0006)</w:t>
+              <w:t xml:space="preserve">نسب خسارة افتراضية لمصفوفة مخصص الذمم: 1 و5 و20 و50%، و10% للحكومي فوق سنة، بحالة مسودة تعتمدها الخزينة؛ في </w:t>
+            </w:r>
+            <w:r>
+              <w:rPr>
+                <w:rFonts w:ascii="Courier New" w:cs="Courier New" w:eastAsia="Courier New" w:hAnsi="Courier New"/>
+                <w:b w:val="false"/>
+                <w:bCs w:val="false"/>
+                <w:color w:val="1F2937"/>
+                <w:sz w:val="16"/>
+                <w:szCs w:val="16"/>
+                <w:shd w:fill="F1F3F5" w:color="auto" w:val="clear"/>
+                <w:rtl/>
+              </w:rPr>
+              <w:t xml:space="preserve">‎db/seed/packs/FIN.PROVISION/v1/‎</w:t>
+            </w:r>
+            <w:r>
+              <w:rPr>
+                <w:rFonts w:ascii="Arial" w:cs="Arial" w:eastAsia="Arial" w:hAnsi="Arial"/>
+                <w:b w:val="false"/>
+                <w:bCs w:val="false"/>
+                <w:sz w:val="18"/>
+                <w:szCs w:val="18"/>
+                <w:rtl/>
+              </w:rPr>
+              <w:t xml:space="preserve"> (ADR 0030)</w:t>
             </w:r>
           </w:p>
         </w:tc>
@@ -7666,7 +7714,7 @@
                 <w:szCs w:val="18"/>
                 <w:rtl/>
               </w:rPr>
-              <w:t xml:space="preserve">db/model/11-organization-party.model:407-441</w:t>
+              <w:t xml:space="preserve">القرار 35 (D4)</w:t>
             </w:r>
           </w:p>
         </w:tc>
@@ -7702,7 +7750,7 @@
                 <w:szCs w:val="18"/>
                 <w:rtl/>
               </w:rPr>
-              <w:t xml:space="preserve">S2</w:t>
+              <w:t xml:space="preserve">S2-ب</w:t>
             </w:r>
           </w:p>
         </w:tc>
@@ -7744,7 +7792,7 @@
                 <w:szCs w:val="18"/>
                 <w:rtl/>
               </w:rPr>
-              <w:t xml:space="preserve">CMP.TERMS</w:t>
+              <w:t xml:space="preserve">PTY.KYC</w:t>
             </w:r>
           </w:p>
         </w:tc>
@@ -7781,7 +7829,7 @@
                 <w:szCs w:val="18"/>
                 <w:rtl/>
               </w:rPr>
-              <w:t xml:space="preserve">cmp.TermType</w:t>
+              <w:t xml:space="preserve">pty.KycProfile، pty.KycProfileItem</w:t>
             </w:r>
           </w:p>
         </w:tc>
@@ -7818,7 +7866,7 @@
                 <w:szCs w:val="18"/>
                 <w:rtl/>
               </w:rPr>
-              <w:t xml:space="preserve">مفاتيح الشروط القابلة للمقارنة</w:t>
+              <w:t xml:space="preserve">ملفات KYC المسبقة من 05 §3؛ يُكتب كل ملف مسودة ثم بنوده ثم يُفعَّل، لأن بنود النسخة الفعّالة لا تتغير (ADR 0006)</w:t>
             </w:r>
           </w:p>
         </w:tc>
@@ -7855,7 +7903,7 @@
                 <w:szCs w:val="18"/>
                 <w:rtl/>
               </w:rPr>
-              <w:t xml:space="preserve">db/model/13-facilities-pricing-terms.model:542</w:t>
+              <w:t xml:space="preserve">db/model/11-organization-party.model:407-441</w:t>
             </w:r>
           </w:p>
         </w:tc>
@@ -7933,7 +7981,7 @@
                 <w:szCs w:val="18"/>
                 <w:rtl/>
               </w:rPr>
-              <w:t xml:space="preserve">FIN.LINES</w:t>
+              <w:t xml:space="preserve">CMP.TERMS</w:t>
             </w:r>
           </w:p>
         </w:tc>
@@ -7969,7 +8017,7 @@
                 <w:szCs w:val="18"/>
                 <w:rtl/>
               </w:rPr>
-              <w:t xml:space="preserve">fin.LineCatalogItem</w:t>
+              <w:t xml:space="preserve">cmp.TermType</w:t>
             </w:r>
           </w:p>
         </w:tc>
@@ -8005,7 +8053,7 @@
                 <w:szCs w:val="18"/>
                 <w:rtl/>
               </w:rPr>
-              <w:t xml:space="preserve">39 بندًا</w:t>
+              <w:t xml:space="preserve">مفاتيح الشروط القابلة للمقارنة</w:t>
             </w:r>
           </w:p>
         </w:tc>
@@ -8041,7 +8089,7 @@
                 <w:szCs w:val="18"/>
                 <w:rtl/>
               </w:rPr>
-              <w:t xml:space="preserve">db/model/14-collateral-obligations-financials.model:383</w:t>
+              <w:t xml:space="preserve">db/model/13-facilities-pricing-terms.model:542</w:t>
             </w:r>
           </w:p>
         </w:tc>
@@ -8077,7 +8125,7 @@
                 <w:szCs w:val="18"/>
                 <w:rtl/>
               </w:rPr>
-              <w:t xml:space="preserve">S2-ب</w:t>
+              <w:t xml:space="preserve">S2</w:t>
             </w:r>
           </w:p>
         </w:tc>
@@ -8119,7 +8167,7 @@
                 <w:szCs w:val="18"/>
                 <w:rtl/>
               </w:rPr>
-              <w:t xml:space="preserve">WFL.BASE</w:t>
+              <w:t xml:space="preserve">FIN.LINES</w:t>
             </w:r>
           </w:p>
         </w:tc>
@@ -8156,7 +8204,7 @@
                 <w:szCs w:val="18"/>
                 <w:rtl/>
               </w:rPr>
-              <w:t xml:space="preserve">wfl.ExternalPhase، wfl.RequestType، wfl.WorkflowTemplate</w:t>
+              <w:t xml:space="preserve">fin.LineCatalogItem</w:t>
             </w:r>
           </w:p>
         </w:tc>
@@ -8193,7 +8241,7 @@
                 <w:szCs w:val="18"/>
                 <w:rtl/>
               </w:rPr>
-              <w:t xml:space="preserve">8 مراحل ظاهرة وأنواع الطلبات وقوالبها</w:t>
+              <w:t xml:space="preserve">39 بندًا</w:t>
             </w:r>
           </w:p>
         </w:tc>
@@ -8230,7 +8278,7 @@
                 <w:szCs w:val="18"/>
                 <w:rtl/>
               </w:rPr>
-              <w:t xml:space="preserve">db/model/15-workflow-notifications.model:20-96</w:t>
+              <w:t xml:space="preserve">db/model/14-collateral-obligations-financials.model:383</w:t>
             </w:r>
           </w:p>
         </w:tc>
@@ -8267,7 +8315,7 @@
                 <w:szCs w:val="18"/>
                 <w:rtl/>
               </w:rPr>
-              <w:t xml:space="preserve">S3</w:t>
+              <w:t xml:space="preserve">S2-ب</w:t>
             </w:r>
           </w:p>
         </w:tc>
@@ -8308,6 +8356,192 @@
                 <w:szCs w:val="18"/>
                 <w:rtl/>
               </w:rPr>
+              <w:t xml:space="preserve">WFL.BASE</w:t>
+            </w:r>
+          </w:p>
+        </w:tc>
+        <w:tc>
+          <w:tcPr>
+            <w:tcW w:type="dxa" w:w="1915"/>
+            <w:tcBorders>
+              <w:top w:val="single" w:color="BFC9D6" w:sz="4"/>
+              <w:left w:val="single" w:color="BFC9D6" w:sz="4"/>
+              <w:bottom w:val="single" w:color="BFC9D6" w:sz="4"/>
+              <w:right w:val="single" w:color="BFC9D6" w:sz="4"/>
+            </w:tcBorders>
+            <w:tcMar>
+              <w:top w:type="dxa" w:w="50"/>
+              <w:left w:type="dxa" w:w="90"/>
+              <w:bottom w:type="dxa" w:w="50"/>
+              <w:right w:type="dxa" w:w="90"/>
+            </w:tcMar>
+            <w:vAlign w:val="top"/>
+          </w:tcPr>
+          <w:p>
+            <w:pPr>
+              <w:keepNext w:val="false"/>
+              <w:bidi/>
+              <w:spacing w:after="30" w:before="30" w:line="264"/>
+            </w:pPr>
+            <w:r>
+              <w:rPr>
+                <w:rFonts w:ascii="Arial" w:cs="Arial" w:eastAsia="Arial" w:hAnsi="Arial"/>
+                <w:b w:val="false"/>
+                <w:bCs w:val="false"/>
+                <w:sz w:val="18"/>
+                <w:szCs w:val="18"/>
+                <w:rtl/>
+              </w:rPr>
+              <w:t xml:space="preserve">wfl.ExternalPhase، wfl.RequestType، wfl.WorkflowTemplate</w:t>
+            </w:r>
+          </w:p>
+        </w:tc>
+        <w:tc>
+          <w:tcPr>
+            <w:tcW w:type="dxa" w:w="2120"/>
+            <w:tcBorders>
+              <w:top w:val="single" w:color="BFC9D6" w:sz="4"/>
+              <w:left w:val="single" w:color="BFC9D6" w:sz="4"/>
+              <w:bottom w:val="single" w:color="BFC9D6" w:sz="4"/>
+              <w:right w:val="single" w:color="BFC9D6" w:sz="4"/>
+            </w:tcBorders>
+            <w:tcMar>
+              <w:top w:type="dxa" w:w="50"/>
+              <w:left w:type="dxa" w:w="90"/>
+              <w:bottom w:type="dxa" w:w="50"/>
+              <w:right w:type="dxa" w:w="90"/>
+            </w:tcMar>
+            <w:vAlign w:val="top"/>
+          </w:tcPr>
+          <w:p>
+            <w:pPr>
+              <w:keepNext w:val="false"/>
+              <w:bidi/>
+              <w:spacing w:after="30" w:before="30" w:line="264"/>
+            </w:pPr>
+            <w:r>
+              <w:rPr>
+                <w:rFonts w:ascii="Arial" w:cs="Arial" w:eastAsia="Arial" w:hAnsi="Arial"/>
+                <w:b w:val="false"/>
+                <w:bCs w:val="false"/>
+                <w:sz w:val="18"/>
+                <w:szCs w:val="18"/>
+                <w:rtl/>
+              </w:rPr>
+              <w:t xml:space="preserve">8 مراحل ظاهرة وأنواع الطلبات وقوالبها</w:t>
+            </w:r>
+          </w:p>
+        </w:tc>
+        <w:tc>
+          <w:tcPr>
+            <w:tcW w:type="dxa" w:w="3765"/>
+            <w:tcBorders>
+              <w:top w:val="single" w:color="BFC9D6" w:sz="4"/>
+              <w:left w:val="single" w:color="BFC9D6" w:sz="4"/>
+              <w:bottom w:val="single" w:color="BFC9D6" w:sz="4"/>
+              <w:right w:val="single" w:color="BFC9D6" w:sz="4"/>
+            </w:tcBorders>
+            <w:tcMar>
+              <w:top w:type="dxa" w:w="50"/>
+              <w:left w:type="dxa" w:w="90"/>
+              <w:bottom w:type="dxa" w:w="50"/>
+              <w:right w:type="dxa" w:w="90"/>
+            </w:tcMar>
+            <w:vAlign w:val="top"/>
+          </w:tcPr>
+          <w:p>
+            <w:pPr>
+              <w:keepNext w:val="false"/>
+              <w:bidi/>
+              <w:spacing w:after="30" w:before="30" w:line="264"/>
+            </w:pPr>
+            <w:r>
+              <w:rPr>
+                <w:rFonts w:ascii="Arial" w:cs="Arial" w:eastAsia="Arial" w:hAnsi="Arial"/>
+                <w:b w:val="false"/>
+                <w:bCs w:val="false"/>
+                <w:sz w:val="18"/>
+                <w:szCs w:val="18"/>
+                <w:rtl/>
+              </w:rPr>
+              <w:t xml:space="preserve">db/model/15-workflow-notifications.model:20-96</w:t>
+            </w:r>
+          </w:p>
+        </w:tc>
+        <w:tc>
+          <w:tcPr>
+            <w:tcW w:type="dxa" w:w="970"/>
+            <w:tcBorders>
+              <w:top w:val="single" w:color="BFC9D6" w:sz="4"/>
+              <w:left w:val="single" w:color="BFC9D6" w:sz="4"/>
+              <w:bottom w:val="single" w:color="BFC9D6" w:sz="4"/>
+              <w:right w:val="single" w:color="BFC9D6" w:sz="4"/>
+            </w:tcBorders>
+            <w:tcMar>
+              <w:top w:type="dxa" w:w="50"/>
+              <w:left w:type="dxa" w:w="90"/>
+              <w:bottom w:type="dxa" w:w="50"/>
+              <w:right w:type="dxa" w:w="90"/>
+            </w:tcMar>
+            <w:vAlign w:val="top"/>
+          </w:tcPr>
+          <w:p>
+            <w:pPr>
+              <w:keepNext w:val="false"/>
+              <w:bidi/>
+              <w:spacing w:after="30" w:before="30" w:line="264"/>
+            </w:pPr>
+            <w:r>
+              <w:rPr>
+                <w:rFonts w:ascii="Arial" w:cs="Arial" w:eastAsia="Arial" w:hAnsi="Arial"/>
+                <w:b w:val="false"/>
+                <w:bCs w:val="false"/>
+                <w:sz w:val="18"/>
+                <w:szCs w:val="18"/>
+                <w:rtl/>
+              </w:rPr>
+              <w:t xml:space="preserve">S3</w:t>
+            </w:r>
+          </w:p>
+        </w:tc>
+      </w:tr>
+      <w:tr>
+        <w:trPr>
+          <w:cantSplit/>
+        </w:trPr>
+        <w:tc>
+          <w:tcPr>
+            <w:tcW w:type="dxa" w:w="1094"/>
+            <w:tcBorders>
+              <w:top w:val="single" w:color="BFC9D6" w:sz="4"/>
+              <w:left w:val="single" w:color="BFC9D6" w:sz="4"/>
+              <w:bottom w:val="single" w:color="BFC9D6" w:sz="4"/>
+              <w:right w:val="single" w:color="BFC9D6" w:sz="4"/>
+            </w:tcBorders>
+            <w:shd w:fill="F5F8FC" w:color="auto" w:val="clear"/>
+            <w:tcMar>
+              <w:top w:type="dxa" w:w="50"/>
+              <w:left w:type="dxa" w:w="90"/>
+              <w:bottom w:type="dxa" w:w="50"/>
+              <w:right w:type="dxa" w:w="90"/>
+            </w:tcMar>
+            <w:vAlign w:val="top"/>
+          </w:tcPr>
+          <w:p>
+            <w:pPr>
+              <w:keepNext w:val="false"/>
+              <w:bidi/>
+              <w:spacing w:after="30" w:before="30" w:line="264"/>
+            </w:pPr>
+            <w:r>
+              <w:rPr>
+                <w:rFonts w:ascii="Arial" w:cs="Arial" w:eastAsia="Arial" w:hAnsi="Arial"/>
+                <w:b w:val="false"/>
+                <w:bCs w:val="false"/>
+                <w:sz w:val="18"/>
+                <w:szCs w:val="18"/>
+                <w:rtl/>
+              </w:rPr>
               <w:t xml:space="preserve">LC.BASE</w:t>
             </w:r>
           </w:p>
@@ -8321,6 +8555,7 @@
               <w:bottom w:val="single" w:color="BFC9D6" w:sz="4"/>
               <w:right w:val="single" w:color="BFC9D6" w:sz="4"/>
             </w:tcBorders>
+            <w:shd w:fill="F5F8FC" w:color="auto" w:val="clear"/>
             <w:tcMar>
               <w:top w:type="dxa" w:w="50"/>
               <w:left w:type="dxa" w:w="90"/>
@@ -8357,6 +8592,7 @@
               <w:bottom w:val="single" w:color="BFC9D6" w:sz="4"/>
               <w:right w:val="single" w:color="BFC9D6" w:sz="4"/>
             </w:tcBorders>
+            <w:shd w:fill="F5F8FC" w:color="auto" w:val="clear"/>
             <w:tcMar>
               <w:top w:type="dxa" w:w="50"/>
               <w:left w:type="dxa" w:w="90"/>
@@ -8393,6 +8629,7 @@
               <w:bottom w:val="single" w:color="BFC9D6" w:sz="4"/>
               <w:right w:val="single" w:color="BFC9D6" w:sz="4"/>
             </w:tcBorders>
+            <w:shd w:fill="F5F8FC" w:color="auto" w:val="clear"/>
             <w:tcMar>
               <w:top w:type="dxa" w:w="50"/>
               <w:left w:type="dxa" w:w="90"/>
@@ -8429,6 +8666,7 @@
               <w:bottom w:val="single" w:color="BFC9D6" w:sz="4"/>
               <w:right w:val="single" w:color="BFC9D6" w:sz="4"/>
             </w:tcBorders>
+            <w:shd w:fill="F5F8FC" w:color="auto" w:val="clear"/>
             <w:tcMar>
               <w:top w:type="dxa" w:w="50"/>
               <w:left w:type="dxa" w:w="90"/>
@@ -19814,7 +20052,7 @@
                 <w:szCs w:val="18"/>
                 <w:rtl/>
               </w:rPr>
-              <w:t xml:space="preserve"> معتمد من المالك (2026-10-12): TA وTM وFO وTE وFA وRQ وAU كما في 12-m5…:46، وتُثبَّت في 10 §2</w:t>
+              <w:t xml:space="preserve"> معتمد من المالك (2026-10-12): TA وTM وFO وTE وFA وRQ وAU كما في 12-m5…:46، وتُثبَّت في 10 §2؛ وأضاف المالك RK مسؤول المخاطر في 2026-10-20 (القرار 35)</w:t>
             </w:r>
           </w:p>
         </w:tc>

</xml_diff>